<commit_message>
chore: save current preview work
</commit_message>
<xml_diff>
--- a/backend/src/main/resources/static/demo/files/sample-complex.docx
+++ b/backend/src/main/resources/static/demo/files/sample-complex.docx
@@ -8,7 +8,7 @@
         <w:jc w:val="center"/>
       </w:pPr>
       <w:r>
-        <w:t>Modern Preview-Only File Viewer</w:t>
+        <w:t>EasyPreviewer</w:t>
       </w:r>
     </w:p>
     <w:p>
@@ -43,7 +43,7 @@
         <w:pStyle w:val="ListBullet"/>
       </w:pPr>
       <w:r>
-        <w:t>Commercial-friendly license target: Apache-2.0</w:t>
+        <w:t>Brand target: EasyPreviewer</w:t>
       </w:r>
     </w:p>
     <w:p>

</xml_diff>